<commit_message>
fix: sample requests descriptions & docs: write readme & docs: finish report
</commit_message>
<xml_diff>
--- a/docs/Отчет_Бэкенд_Клиенты_ЦПИ41_МоревАВ.docx
+++ b/docs/Отчет_Бэкенд_Клиенты_ЦПИ41_МоревАВ.docx
@@ -843,7 +843,7 @@
             </w:rPr>
             <w:fldChar w:fldCharType="separate"/>
           </w:r>
-          <w:hyperlink w:anchor="_Toc224476436" w:history="1">
+          <w:hyperlink w:anchor="_Toc224479033" w:history="1">
             <w:r>
               <w:rPr>
                 <w:rStyle w:val="aa"/>
@@ -870,7 +870,7 @@
                 <w:noProof/>
                 <w:webHidden/>
               </w:rPr>
-              <w:instrText xml:space="preserve"> PAGEREF _Toc224476436 \h </w:instrText>
+              <w:instrText xml:space="preserve"> PAGEREF _Toc224479033 \h </w:instrText>
             </w:r>
             <w:r>
               <w:rPr>
@@ -914,13 +914,27 @@
               <w:lang w:eastAsia="ru-RU"/>
             </w:rPr>
           </w:pPr>
-          <w:hyperlink w:anchor="_Toc224476437" w:history="1">
+          <w:hyperlink w:anchor="_Toc224479034" w:history="1">
             <w:r>
               <w:rPr>
                 <w:rStyle w:val="aa"/>
                 <w:noProof/>
               </w:rPr>
-              <w:t>2 Описание предметной области</w:t>
+              <w:t>2 Описание предмет</w:t>
+            </w:r>
+            <w:r>
+              <w:rPr>
+                <w:rStyle w:val="aa"/>
+                <w:noProof/>
+              </w:rPr>
+              <w:t>н</w:t>
+            </w:r>
+            <w:r>
+              <w:rPr>
+                <w:rStyle w:val="aa"/>
+                <w:noProof/>
+              </w:rPr>
+              <w:t>ой области</w:t>
             </w:r>
             <w:r>
               <w:rPr>
@@ -941,7 +955,7 @@
                 <w:noProof/>
                 <w:webHidden/>
               </w:rPr>
-              <w:instrText xml:space="preserve"> PAGEREF _Toc224476437 \h </w:instrText>
+              <w:instrText xml:space="preserve"> PAGEREF _Toc224479034 \h </w:instrText>
             </w:r>
             <w:r>
               <w:rPr>
@@ -985,7 +999,7 @@
               <w:lang w:eastAsia="ru-RU"/>
             </w:rPr>
           </w:pPr>
-          <w:hyperlink w:anchor="_Toc224476438" w:history="1">
+          <w:hyperlink w:anchor="_Toc224479035" w:history="1">
             <w:r>
               <w:rPr>
                 <w:rStyle w:val="aa"/>
@@ -1012,7 +1026,7 @@
                 <w:noProof/>
                 <w:webHidden/>
               </w:rPr>
-              <w:instrText xml:space="preserve"> PAGEREF _Toc224476438 \h </w:instrText>
+              <w:instrText xml:space="preserve"> PAGEREF _Toc224479035 \h </w:instrText>
             </w:r>
             <w:r>
               <w:rPr>
@@ -1056,7 +1070,7 @@
               <w:lang w:eastAsia="ru-RU"/>
             </w:rPr>
           </w:pPr>
-          <w:hyperlink w:anchor="_Toc224476439" w:history="1">
+          <w:hyperlink w:anchor="_Toc224479036" w:history="1">
             <w:r>
               <w:rPr>
                 <w:rStyle w:val="aa"/>
@@ -1083,7 +1097,7 @@
                 <w:noProof/>
                 <w:webHidden/>
               </w:rPr>
-              <w:instrText xml:space="preserve"> PAGEREF _Toc224476439 \h </w:instrText>
+              <w:instrText xml:space="preserve"> PAGEREF _Toc224479036 \h </w:instrText>
             </w:r>
             <w:r>
               <w:rPr>
@@ -1127,7 +1141,7 @@
               <w:lang w:eastAsia="ru-RU"/>
             </w:rPr>
           </w:pPr>
-          <w:hyperlink w:anchor="_Toc224476440" w:history="1">
+          <w:hyperlink w:anchor="_Toc224479037" w:history="1">
             <w:r>
               <w:rPr>
                 <w:rStyle w:val="aa"/>
@@ -1162,7 +1176,7 @@
                 <w:noProof/>
                 <w:webHidden/>
               </w:rPr>
-              <w:instrText xml:space="preserve"> PAGEREF _Toc224476440 \h </w:instrText>
+              <w:instrText xml:space="preserve"> PAGEREF _Toc224479037 \h </w:instrText>
             </w:r>
             <w:r>
               <w:rPr>
@@ -1206,7 +1220,7 @@
               <w:lang w:eastAsia="ru-RU"/>
             </w:rPr>
           </w:pPr>
-          <w:hyperlink w:anchor="_Toc224476441" w:history="1">
+          <w:hyperlink w:anchor="_Toc224479038" w:history="1">
             <w:r>
               <w:rPr>
                 <w:rStyle w:val="aa"/>
@@ -1234,7 +1248,7 @@
                 <w:noProof/>
                 <w:webHidden/>
               </w:rPr>
-              <w:instrText xml:space="preserve"> PAGEREF _Toc224476441 \h </w:instrText>
+              <w:instrText xml:space="preserve"> PAGEREF _Toc224479038 \h </w:instrText>
             </w:r>
             <w:r>
               <w:rPr>
@@ -1278,7 +1292,7 @@
               <w:lang w:eastAsia="ru-RU"/>
             </w:rPr>
           </w:pPr>
-          <w:hyperlink w:anchor="_Toc224476442" w:history="1">
+          <w:hyperlink w:anchor="_Toc224479039" w:history="1">
             <w:r>
               <w:rPr>
                 <w:rStyle w:val="aa"/>
@@ -1306,7 +1320,7 @@
                 <w:noProof/>
                 <w:webHidden/>
               </w:rPr>
-              <w:instrText xml:space="preserve"> PAGEREF _Toc224476442 \h </w:instrText>
+              <w:instrText xml:space="preserve"> PAGEREF _Toc224479039 \h </w:instrText>
             </w:r>
             <w:r>
               <w:rPr>
@@ -1350,7 +1364,7 @@
               <w:lang w:eastAsia="ru-RU"/>
             </w:rPr>
           </w:pPr>
-          <w:hyperlink w:anchor="_Toc224476443" w:history="1">
+          <w:hyperlink w:anchor="_Toc224479040" w:history="1">
             <w:r>
               <w:rPr>
                 <w:rStyle w:val="aa"/>
@@ -1377,7 +1391,7 @@
                 <w:noProof/>
                 <w:webHidden/>
               </w:rPr>
-              <w:instrText xml:space="preserve"> PAGEREF _Toc224476443 \h </w:instrText>
+              <w:instrText xml:space="preserve"> PAGEREF _Toc224479040 \h </w:instrText>
             </w:r>
             <w:r>
               <w:rPr>
@@ -1421,7 +1435,7 @@
               <w:lang w:eastAsia="ru-RU"/>
             </w:rPr>
           </w:pPr>
-          <w:hyperlink w:anchor="_Toc224476444" w:history="1">
+          <w:hyperlink w:anchor="_Toc224479041" w:history="1">
             <w:r>
               <w:rPr>
                 <w:rStyle w:val="aa"/>
@@ -1448,7 +1462,7 @@
                 <w:noProof/>
                 <w:webHidden/>
               </w:rPr>
-              <w:instrText xml:space="preserve"> PAGEREF _Toc224476444 \h </w:instrText>
+              <w:instrText xml:space="preserve"> PAGEREF _Toc224479041 \h </w:instrText>
             </w:r>
             <w:r>
               <w:rPr>
@@ -1492,27 +1506,13 @@
               <w:lang w:eastAsia="ru-RU"/>
             </w:rPr>
           </w:pPr>
-          <w:hyperlink w:anchor="_Toc224476445" w:history="1">
+          <w:hyperlink w:anchor="_Toc224479042" w:history="1">
             <w:r>
               <w:rPr>
                 <w:rStyle w:val="aa"/>
                 <w:noProof/>
               </w:rPr>
-              <w:t>3.4 Обработка оши</w:t>
-            </w:r>
-            <w:r>
-              <w:rPr>
-                <w:rStyle w:val="aa"/>
-                <w:noProof/>
-              </w:rPr>
-              <w:t>б</w:t>
-            </w:r>
-            <w:r>
-              <w:rPr>
-                <w:rStyle w:val="aa"/>
-                <w:noProof/>
-              </w:rPr>
-              <w:t>ок</w:t>
+              <w:t>3.4 Обработка ошибок</w:t>
             </w:r>
             <w:r>
               <w:rPr>
@@ -1533,7 +1533,7 @@
                 <w:noProof/>
                 <w:webHidden/>
               </w:rPr>
-              <w:instrText xml:space="preserve"> PAGEREF _Toc224476445 \h </w:instrText>
+              <w:instrText xml:space="preserve"> PAGEREF _Toc224479042 \h </w:instrText>
             </w:r>
             <w:r>
               <w:rPr>
@@ -1577,7 +1577,7 @@
               <w:lang w:eastAsia="ru-RU"/>
             </w:rPr>
           </w:pPr>
-          <w:hyperlink w:anchor="_Toc224476446" w:history="1">
+          <w:hyperlink w:anchor="_Toc224479043" w:history="1">
             <w:r>
               <w:rPr>
                 <w:rStyle w:val="aa"/>
@@ -1612,7 +1612,7 @@
                 <w:noProof/>
                 <w:webHidden/>
               </w:rPr>
-              <w:instrText xml:space="preserve"> PAGEREF _Toc224476446 \h </w:instrText>
+              <w:instrText xml:space="preserve"> PAGEREF _Toc224479043 \h </w:instrText>
             </w:r>
             <w:r>
               <w:rPr>
@@ -1632,7 +1632,7 @@
                 <w:noProof/>
                 <w:webHidden/>
               </w:rPr>
-              <w:t>22</w:t>
+              <w:t>25</w:t>
             </w:r>
             <w:r>
               <w:rPr>
@@ -1656,7 +1656,7 @@
               <w:lang w:eastAsia="ru-RU"/>
             </w:rPr>
           </w:pPr>
-          <w:hyperlink w:anchor="_Toc224476447" w:history="1">
+          <w:hyperlink w:anchor="_Toc224479044" w:history="1">
             <w:r>
               <w:rPr>
                 <w:rStyle w:val="aa"/>
@@ -1706,7 +1706,7 @@
                 <w:noProof/>
                 <w:webHidden/>
               </w:rPr>
-              <w:instrText xml:space="preserve"> PAGEREF _Toc224476447 \h </w:instrText>
+              <w:instrText xml:space="preserve"> PAGEREF _Toc224479044 \h </w:instrText>
             </w:r>
             <w:r>
               <w:rPr>
@@ -1726,7 +1726,7 @@
                 <w:noProof/>
                 <w:webHidden/>
               </w:rPr>
-              <w:t>23</w:t>
+              <w:t>26</w:t>
             </w:r>
             <w:r>
               <w:rPr>
@@ -1769,7 +1769,7 @@
       <w:pPr>
         <w:pStyle w:val="1"/>
       </w:pPr>
-      <w:bookmarkStart w:id="0" w:name="_Toc224476436"/>
+      <w:bookmarkStart w:id="0" w:name="_Toc224479033"/>
       <w:r>
         <w:lastRenderedPageBreak/>
         <w:t>1 Цель работы</w:t>
@@ -2089,7 +2089,7 @@
       <w:pPr>
         <w:pStyle w:val="1"/>
       </w:pPr>
-      <w:bookmarkStart w:id="1" w:name="_Toc224476437"/>
+      <w:bookmarkStart w:id="1" w:name="_Toc224479034"/>
       <w:r>
         <w:lastRenderedPageBreak/>
         <w:t xml:space="preserve">2 </w:t>
@@ -2687,7 +2687,7 @@
       <w:pPr>
         <w:pStyle w:val="1"/>
       </w:pPr>
-      <w:bookmarkStart w:id="2" w:name="_Toc224476438"/>
+      <w:bookmarkStart w:id="2" w:name="_Toc224479035"/>
       <w:r>
         <w:lastRenderedPageBreak/>
         <w:t>3 Основная часть</w:t>
@@ -2698,7 +2698,7 @@
       <w:pPr>
         <w:pStyle w:val="2"/>
       </w:pPr>
-      <w:bookmarkStart w:id="3" w:name="_Toc224476439"/>
+      <w:bookmarkStart w:id="3" w:name="_Toc224479036"/>
       <w:r>
         <w:t>3.1 Описание и применение ручек</w:t>
       </w:r>
@@ -2896,7 +2896,7 @@
       <w:pPr>
         <w:pStyle w:val="3"/>
       </w:pPr>
-      <w:bookmarkStart w:id="4" w:name="_Toc224476440"/>
+      <w:bookmarkStart w:id="4" w:name="_Toc224479037"/>
       <w:r>
         <w:t xml:space="preserve">3.1.1 </w:t>
       </w:r>
@@ -4140,7 +4140,7 @@
           <w:lang w:val="en-US"/>
         </w:rPr>
       </w:pPr>
-      <w:bookmarkStart w:id="5" w:name="_Toc224476441"/>
+      <w:bookmarkStart w:id="5" w:name="_Toc224479038"/>
       <w:r>
         <w:rPr>
           <w:lang w:val="en-US"/>
@@ -6647,7 +6647,7 @@
           <w:lang w:val="en-US"/>
         </w:rPr>
       </w:pPr>
-      <w:bookmarkStart w:id="6" w:name="_Toc224476442"/>
+      <w:bookmarkStart w:id="6" w:name="_Toc224479039"/>
       <w:r>
         <w:rPr>
           <w:lang w:val="en-US"/>
@@ -9520,7 +9520,7 @@
       <w:pPr>
         <w:pStyle w:val="2"/>
       </w:pPr>
-      <w:bookmarkStart w:id="7" w:name="_Toc224476443"/>
+      <w:bookmarkStart w:id="7" w:name="_Toc224479040"/>
       <w:r>
         <w:lastRenderedPageBreak/>
         <w:t xml:space="preserve">3.2 Проверка </w:t>
@@ -9825,7 +9825,7 @@
       <w:pPr>
         <w:pStyle w:val="2"/>
       </w:pPr>
-      <w:bookmarkStart w:id="8" w:name="_Toc224476444"/>
+      <w:bookmarkStart w:id="8" w:name="_Toc224479041"/>
       <w:r>
         <w:lastRenderedPageBreak/>
         <w:t>3.3 Валидация данных</w:t>
@@ -10230,7 +10230,7 @@
       <w:pPr>
         <w:pStyle w:val="2"/>
       </w:pPr>
-      <w:bookmarkStart w:id="9" w:name="_Toc224476445"/>
+      <w:bookmarkStart w:id="9" w:name="_Toc224479042"/>
       <w:r>
         <w:lastRenderedPageBreak/>
         <w:t>3.4 Обработка ошибок</w:t>
@@ -11062,12 +11062,7 @@
         <w:t>/3</w:t>
       </w:r>
       <w:r>
-        <w:t xml:space="preserve"> при условии того, что клиент не существует, получаем результат</w:t>
-      </w:r>
-      <w:bookmarkStart w:id="10" w:name="_GoBack"/>
-      <w:bookmarkEnd w:id="10"/>
-      <w:r>
-        <w:t>, представленный на рис. 62.</w:t>
+        <w:t xml:space="preserve"> при условии того, что клиент не существует, получаем результат, представленный на рис. 62.</w:t>
       </w:r>
     </w:p>
     <w:p/>
@@ -11173,7 +11168,7 @@
       <w:pPr>
         <w:pStyle w:val="2"/>
       </w:pPr>
-      <w:bookmarkStart w:id="11" w:name="_Toc224476446"/>
+      <w:bookmarkStart w:id="10" w:name="_Toc224479043"/>
       <w:r>
         <w:t xml:space="preserve">3.5 Описание </w:t>
       </w:r>
@@ -11183,14 +11178,29 @@
         </w:rPr>
         <w:t>README</w:t>
       </w:r>
+      <w:bookmarkEnd w:id="10"/>
+    </w:p>
+    <w:p>
+      <w:pPr>
+        <w:ind w:firstLine="567"/>
+      </w:pPr>
+      <w:r>
+        <w:t xml:space="preserve">Описание </w:t>
+      </w:r>
+      <w:r>
+        <w:rPr>
+          <w:lang w:val="en-US"/>
+        </w:rPr>
+        <w:t>README</w:t>
+      </w:r>
+      <w:r>
+        <w:t>-</w:t>
+      </w:r>
+      <w:r>
+        <w:t>файла представлено в приложении А.</w:t>
+      </w:r>
+      <w:bookmarkStart w:id="11" w:name="_GoBack"/>
       <w:bookmarkEnd w:id="11"/>
-    </w:p>
-    <w:p>
-      <w:proofErr w:type="spellStart"/>
-      <w:r>
-        <w:t>фыв</w:t>
-      </w:r>
-      <w:proofErr w:type="spellEnd"/>
     </w:p>
     <w:p>
       <w:pPr>
@@ -11207,7 +11217,7 @@
         <w:ind w:firstLine="0"/>
         <w:jc w:val="center"/>
       </w:pPr>
-      <w:bookmarkStart w:id="12" w:name="_Toc224476447"/>
+      <w:bookmarkStart w:id="12" w:name="_Toc224479044"/>
       <w:r>
         <w:lastRenderedPageBreak/>
         <w:t xml:space="preserve">Приложение А. </w:t>
@@ -13636,7 +13646,7 @@
 </file>
 
 <file path=customXml/itemProps1.xml><?xml version="1.0" encoding="utf-8"?>
-<ds:datastoreItem xmlns:ds="http://schemas.openxmlformats.org/officeDocument/2006/customXml" ds:itemID="{00F6C0B4-F56C-4F34-A6DF-9E879A0465B5}">
+<ds:datastoreItem xmlns:ds="http://schemas.openxmlformats.org/officeDocument/2006/customXml" ds:itemID="{84B55E52-597A-4413-9070-E5C833892963}">
   <ds:schemaRefs>
     <ds:schemaRef ds:uri="http://schemas.openxmlformats.org/officeDocument/2006/bibliography"/>
   </ds:schemaRefs>

</xml_diff>

<commit_message>
fix: replaced by token
</commit_message>
<xml_diff>
--- a/docs/Отчет_Бэкенд_Клиенты_ЦПИ41_МоревАВ.docx
+++ b/docs/Отчет_Бэкенд_Клиенты_ЦПИ41_МоревАВ.docx
@@ -31,7 +31,16 @@
           <w:rFonts w:cs="Times New Roman"/>
           <w:szCs w:val="28"/>
         </w:rPr>
-        <w:t>Федеральное государственное бюджетное образовательное учреждение высшего образования</w:t>
+        <w:t>Федеральное государственное бюджетное образовательное учреждение выс</w:t>
+      </w:r>
+      <w:bookmarkStart w:id="0" w:name="_GoBack"/>
+      <w:bookmarkEnd w:id="0"/>
+      <w:r>
+        <w:rPr>
+          <w:rFonts w:cs="Times New Roman"/>
+          <w:szCs w:val="28"/>
+        </w:rPr>
+        <w:t>шего образования</w:t>
       </w:r>
     </w:p>
     <w:p>
@@ -1769,12 +1778,12 @@
       <w:pPr>
         <w:pStyle w:val="1"/>
       </w:pPr>
-      <w:bookmarkStart w:id="0" w:name="_Toc224479033"/>
+      <w:bookmarkStart w:id="1" w:name="_Toc224479033"/>
       <w:r>
         <w:lastRenderedPageBreak/>
         <w:t>1 Цель работы</w:t>
       </w:r>
-      <w:bookmarkEnd w:id="0"/>
+      <w:bookmarkEnd w:id="1"/>
     </w:p>
     <w:p>
       <w:pPr>
@@ -2089,7 +2098,7 @@
       <w:pPr>
         <w:pStyle w:val="1"/>
       </w:pPr>
-      <w:bookmarkStart w:id="1" w:name="_Toc224479034"/>
+      <w:bookmarkStart w:id="2" w:name="_Toc224479034"/>
       <w:r>
         <w:lastRenderedPageBreak/>
         <w:t xml:space="preserve">2 </w:t>
@@ -2103,7 +2112,7 @@
       <w:r>
         <w:t xml:space="preserve"> области</w:t>
       </w:r>
-      <w:bookmarkEnd w:id="1"/>
+      <w:bookmarkEnd w:id="2"/>
     </w:p>
     <w:p>
       <w:pPr>
@@ -2687,22 +2696,22 @@
       <w:pPr>
         <w:pStyle w:val="1"/>
       </w:pPr>
-      <w:bookmarkStart w:id="2" w:name="_Toc224479035"/>
+      <w:bookmarkStart w:id="3" w:name="_Toc224479035"/>
       <w:r>
         <w:lastRenderedPageBreak/>
         <w:t>3 Основная часть</w:t>
       </w:r>
-      <w:bookmarkEnd w:id="2"/>
+      <w:bookmarkEnd w:id="3"/>
     </w:p>
     <w:p>
       <w:pPr>
         <w:pStyle w:val="2"/>
       </w:pPr>
-      <w:bookmarkStart w:id="3" w:name="_Toc224479036"/>
+      <w:bookmarkStart w:id="4" w:name="_Toc224479036"/>
       <w:r>
         <w:t>3.1 Описание и применение ручек</w:t>
       </w:r>
-      <w:bookmarkEnd w:id="3"/>
+      <w:bookmarkEnd w:id="4"/>
     </w:p>
     <w:p>
       <w:pPr>
@@ -2896,7 +2905,7 @@
       <w:pPr>
         <w:pStyle w:val="3"/>
       </w:pPr>
-      <w:bookmarkStart w:id="4" w:name="_Toc224479037"/>
+      <w:bookmarkStart w:id="5" w:name="_Toc224479037"/>
       <w:r>
         <w:t xml:space="preserve">3.1.1 </w:t>
       </w:r>
@@ -2907,7 +2916,7 @@
         </w:rPr>
         <w:t>AuthController</w:t>
       </w:r>
-      <w:bookmarkEnd w:id="4"/>
+      <w:bookmarkEnd w:id="5"/>
       <w:proofErr w:type="spellEnd"/>
     </w:p>
     <w:p>
@@ -4140,7 +4149,7 @@
           <w:lang w:val="en-US"/>
         </w:rPr>
       </w:pPr>
-      <w:bookmarkStart w:id="5" w:name="_Toc224479038"/>
+      <w:bookmarkStart w:id="6" w:name="_Toc224479038"/>
       <w:r>
         <w:rPr>
           <w:lang w:val="en-US"/>
@@ -4154,7 +4163,7 @@
         </w:rPr>
         <w:t>UserController</w:t>
       </w:r>
-      <w:bookmarkEnd w:id="5"/>
+      <w:bookmarkEnd w:id="6"/>
       <w:proofErr w:type="spellEnd"/>
     </w:p>
     <w:p>
@@ -6647,7 +6656,7 @@
           <w:lang w:val="en-US"/>
         </w:rPr>
       </w:pPr>
-      <w:bookmarkStart w:id="6" w:name="_Toc224479039"/>
+      <w:bookmarkStart w:id="7" w:name="_Toc224479039"/>
       <w:r>
         <w:rPr>
           <w:lang w:val="en-US"/>
@@ -6661,7 +6670,7 @@
         </w:rPr>
         <w:t>ClientController</w:t>
       </w:r>
-      <w:bookmarkEnd w:id="6"/>
+      <w:bookmarkEnd w:id="7"/>
       <w:proofErr w:type="spellEnd"/>
     </w:p>
     <w:p>
@@ -9520,7 +9529,7 @@
       <w:pPr>
         <w:pStyle w:val="2"/>
       </w:pPr>
-      <w:bookmarkStart w:id="7" w:name="_Toc224479040"/>
+      <w:bookmarkStart w:id="8" w:name="_Toc224479040"/>
       <w:r>
         <w:lastRenderedPageBreak/>
         <w:t xml:space="preserve">3.2 Проверка </w:t>
@@ -9528,7 +9537,7 @@
       <w:r>
         <w:t>доступа без авторизации</w:t>
       </w:r>
-      <w:bookmarkEnd w:id="7"/>
+      <w:bookmarkEnd w:id="8"/>
     </w:p>
     <w:p>
       <w:pPr>
@@ -9825,12 +9834,12 @@
       <w:pPr>
         <w:pStyle w:val="2"/>
       </w:pPr>
-      <w:bookmarkStart w:id="8" w:name="_Toc224479041"/>
+      <w:bookmarkStart w:id="9" w:name="_Toc224479041"/>
       <w:r>
         <w:lastRenderedPageBreak/>
         <w:t>3.3 Валидация данных</w:t>
       </w:r>
-      <w:bookmarkEnd w:id="8"/>
+      <w:bookmarkEnd w:id="9"/>
     </w:p>
     <w:p>
       <w:pPr>
@@ -10230,12 +10239,12 @@
       <w:pPr>
         <w:pStyle w:val="2"/>
       </w:pPr>
-      <w:bookmarkStart w:id="9" w:name="_Toc224479042"/>
+      <w:bookmarkStart w:id="10" w:name="_Toc224479042"/>
       <w:r>
         <w:lastRenderedPageBreak/>
         <w:t>3.4 Обработка ошибок</w:t>
       </w:r>
-      <w:bookmarkEnd w:id="9"/>
+      <w:bookmarkEnd w:id="10"/>
     </w:p>
     <w:p>
       <w:pPr>
@@ -11168,7 +11177,7 @@
       <w:pPr>
         <w:pStyle w:val="2"/>
       </w:pPr>
-      <w:bookmarkStart w:id="10" w:name="_Toc224479043"/>
+      <w:bookmarkStart w:id="11" w:name="_Toc224479043"/>
       <w:r>
         <w:t xml:space="preserve">3.5 Описание </w:t>
       </w:r>
@@ -11178,11 +11187,14 @@
         </w:rPr>
         <w:t>README</w:t>
       </w:r>
-      <w:bookmarkEnd w:id="10"/>
+      <w:bookmarkEnd w:id="11"/>
     </w:p>
     <w:p>
       <w:pPr>
         <w:ind w:firstLine="567"/>
+        <w:rPr>
+          <w:lang w:val="en-US"/>
+        </w:rPr>
       </w:pPr>
       <w:r>
         <w:t xml:space="preserve">Описание </w:t>
@@ -11199,8 +11211,6 @@
       <w:r>
         <w:t>файла представлено в приложении А.</w:t>
       </w:r>
-      <w:bookmarkStart w:id="11" w:name="_GoBack"/>
-      <w:bookmarkEnd w:id="11"/>
     </w:p>
     <w:p>
       <w:pPr>
@@ -11216,6 +11226,9 @@
         <w:pStyle w:val="1"/>
         <w:ind w:firstLine="0"/>
         <w:jc w:val="center"/>
+        <w:rPr>
+          <w:lang w:val="en-US"/>
+        </w:rPr>
       </w:pPr>
       <w:bookmarkStart w:id="12" w:name="_Toc224479044"/>
       <w:r>
@@ -11238,6 +11251,2122 @@
         <w:t>md</w:t>
       </w:r>
       <w:bookmarkEnd w:id="12"/>
+    </w:p>
+    <w:p>
+      <w:r>
+        <w:t xml:space="preserve"># </w:t>
+      </w:r>
+      <w:r>
+        <w:rPr>
+          <w:lang w:val="en-US"/>
+        </w:rPr>
+        <w:t>backend</w:t>
+      </w:r>
+      <w:r>
+        <w:t>-</w:t>
+      </w:r>
+      <w:r>
+        <w:rPr>
+          <w:lang w:val="en-US"/>
+        </w:rPr>
+        <w:t>development</w:t>
+      </w:r>
+    </w:p>
+    <w:p/>
+    <w:p>
+      <w:r>
+        <w:t>## Название проекта</w:t>
+      </w:r>
+    </w:p>
+    <w:p/>
+    <w:p>
+      <w:r>
+        <w:t xml:space="preserve">**РАЗРАБОТКА </w:t>
+      </w:r>
+      <w:r>
+        <w:rPr>
+          <w:lang w:val="en-US"/>
+        </w:rPr>
+        <w:t>REST</w:t>
+      </w:r>
+      <w:r>
+        <w:t xml:space="preserve"> </w:t>
+      </w:r>
+      <w:r>
+        <w:rPr>
+          <w:lang w:val="en-US"/>
+        </w:rPr>
+        <w:t>API</w:t>
+      </w:r>
+      <w:r>
+        <w:t xml:space="preserve"> ДЛЯ ПРЕДМЕТНОЙ ОБЛАСТИ «КЛИЕНТЫ» С ПОДДЕРЖКОЙ ОПЕРАЦИЙ </w:t>
+      </w:r>
+      <w:r>
+        <w:rPr>
+          <w:lang w:val="en-US"/>
+        </w:rPr>
+        <w:t>GET</w:t>
+      </w:r>
+      <w:r>
+        <w:t xml:space="preserve">, </w:t>
+      </w:r>
+      <w:r>
+        <w:rPr>
+          <w:lang w:val="en-US"/>
+        </w:rPr>
+        <w:t>POST</w:t>
+      </w:r>
+      <w:r>
+        <w:t xml:space="preserve">, </w:t>
+      </w:r>
+      <w:r>
+        <w:rPr>
+          <w:lang w:val="en-US"/>
+        </w:rPr>
+        <w:t>PUT</w:t>
+      </w:r>
+      <w:r>
+        <w:t xml:space="preserve">, </w:t>
+      </w:r>
+      <w:r>
+        <w:rPr>
+          <w:lang w:val="en-US"/>
+        </w:rPr>
+        <w:t>PATCH</w:t>
+      </w:r>
+      <w:r>
+        <w:t xml:space="preserve">, </w:t>
+      </w:r>
+      <w:r>
+        <w:rPr>
+          <w:lang w:val="en-US"/>
+        </w:rPr>
+        <w:t>DELETE</w:t>
+      </w:r>
+      <w:r>
+        <w:t>**</w:t>
+      </w:r>
+    </w:p>
+    <w:p/>
+    <w:p>
+      <w:r>
+        <w:t>## Описание предметной области</w:t>
+      </w:r>
+    </w:p>
+    <w:p/>
+    <w:p>
+      <w:r>
+        <w:t>Выбранная предметная область – Вариант №7 «Клиенты».</w:t>
+      </w:r>
+    </w:p>
+    <w:p>
+      <w:r>
+        <w:t>В ней основной сущностью является сущность «</w:t>
+      </w:r>
+      <w:r>
+        <w:rPr>
+          <w:lang w:val="en-US"/>
+        </w:rPr>
+        <w:t>Client</w:t>
+      </w:r>
+      <w:r>
+        <w:t>» со следующими полями:</w:t>
+      </w:r>
+    </w:p>
+    <w:p/>
+    <w:p>
+      <w:pPr>
+        <w:rPr>
+          <w:lang w:val="en-US"/>
+        </w:rPr>
+      </w:pPr>
+      <w:r>
+        <w:rPr>
+          <w:lang w:val="en-US"/>
+        </w:rPr>
+        <w:t>- id,</w:t>
+      </w:r>
+    </w:p>
+    <w:p>
+      <w:pPr>
+        <w:rPr>
+          <w:lang w:val="en-US"/>
+        </w:rPr>
+      </w:pPr>
+      <w:r>
+        <w:rPr>
+          <w:lang w:val="en-US"/>
+        </w:rPr>
+        <w:t xml:space="preserve">- </w:t>
+      </w:r>
+      <w:proofErr w:type="spellStart"/>
+      <w:r>
+        <w:rPr>
+          <w:lang w:val="en-US"/>
+        </w:rPr>
+        <w:t>fullName</w:t>
+      </w:r>
+      <w:proofErr w:type="spellEnd"/>
+      <w:r>
+        <w:rPr>
+          <w:lang w:val="en-US"/>
+        </w:rPr>
+        <w:t>,</w:t>
+      </w:r>
+    </w:p>
+    <w:p>
+      <w:pPr>
+        <w:rPr>
+          <w:lang w:val="en-US"/>
+        </w:rPr>
+      </w:pPr>
+      <w:r>
+        <w:rPr>
+          <w:lang w:val="en-US"/>
+        </w:rPr>
+        <w:t>- phone,</w:t>
+      </w:r>
+    </w:p>
+    <w:p>
+      <w:pPr>
+        <w:rPr>
+          <w:lang w:val="en-US"/>
+        </w:rPr>
+      </w:pPr>
+      <w:r>
+        <w:rPr>
+          <w:lang w:val="en-US"/>
+        </w:rPr>
+        <w:t>- email,</w:t>
+      </w:r>
+    </w:p>
+    <w:p>
+      <w:pPr>
+        <w:rPr>
+          <w:lang w:val="en-US"/>
+        </w:rPr>
+      </w:pPr>
+      <w:r>
+        <w:rPr>
+          <w:lang w:val="en-US"/>
+        </w:rPr>
+        <w:t>- discount,</w:t>
+      </w:r>
+    </w:p>
+    <w:p>
+      <w:r>
+        <w:t xml:space="preserve">- </w:t>
+      </w:r>
+      <w:r>
+        <w:rPr>
+          <w:lang w:val="en-US"/>
+        </w:rPr>
+        <w:t>verified</w:t>
+      </w:r>
+      <w:r>
+        <w:t>.</w:t>
+      </w:r>
+    </w:p>
+    <w:p/>
+    <w:p>
+      <w:r>
+        <w:t>Дополнительно в серверном приложении имеется сущность «</w:t>
+      </w:r>
+      <w:r>
+        <w:rPr>
+          <w:lang w:val="en-US"/>
+        </w:rPr>
+        <w:t>User</w:t>
+      </w:r>
+      <w:r>
+        <w:t>», представляющая собой пользователей, имеющими доступ к сущностям «</w:t>
+      </w:r>
+      <w:r>
+        <w:rPr>
+          <w:lang w:val="en-US"/>
+        </w:rPr>
+        <w:t>Client</w:t>
+      </w:r>
+      <w:r>
+        <w:t>».</w:t>
+      </w:r>
+    </w:p>
+    <w:p>
+      <w:r>
+        <w:t>Поля сущности «</w:t>
+      </w:r>
+      <w:r>
+        <w:rPr>
+          <w:lang w:val="en-US"/>
+        </w:rPr>
+        <w:t>User</w:t>
+      </w:r>
+      <w:r>
+        <w:t>» представлены в списке ниже:</w:t>
+      </w:r>
+    </w:p>
+    <w:p/>
+    <w:p>
+      <w:r>
+        <w:t xml:space="preserve">- </w:t>
+      </w:r>
+      <w:r>
+        <w:rPr>
+          <w:lang w:val="en-US"/>
+        </w:rPr>
+        <w:t>id</w:t>
+      </w:r>
+      <w:r>
+        <w:t>,</w:t>
+      </w:r>
+    </w:p>
+    <w:p>
+      <w:r>
+        <w:t xml:space="preserve">- </w:t>
+      </w:r>
+      <w:r>
+        <w:rPr>
+          <w:lang w:val="en-US"/>
+        </w:rPr>
+        <w:t>login</w:t>
+      </w:r>
+      <w:r>
+        <w:t>,</w:t>
+      </w:r>
+    </w:p>
+    <w:p>
+      <w:r>
+        <w:t xml:space="preserve">- </w:t>
+      </w:r>
+      <w:proofErr w:type="spellStart"/>
+      <w:r>
+        <w:rPr>
+          <w:lang w:val="en-US"/>
+        </w:rPr>
+        <w:t>hashPassword</w:t>
+      </w:r>
+      <w:proofErr w:type="spellEnd"/>
+      <w:r>
+        <w:t>.</w:t>
+      </w:r>
+    </w:p>
+    <w:p/>
+    <w:p>
+      <w:r>
+        <w:t xml:space="preserve">Так как в серверном приложении используется авторизация с помощью </w:t>
+      </w:r>
+      <w:r>
+        <w:rPr>
+          <w:lang w:val="en-US"/>
+        </w:rPr>
+        <w:t>JWT</w:t>
+      </w:r>
+      <w:r>
+        <w:t>-токенов, дополнительно реализован механизм «</w:t>
+      </w:r>
+      <w:r>
+        <w:rPr>
+          <w:lang w:val="en-US"/>
+        </w:rPr>
+        <w:t>Refresh</w:t>
+      </w:r>
+      <w:r>
+        <w:t xml:space="preserve"> </w:t>
+      </w:r>
+      <w:r>
+        <w:rPr>
+          <w:lang w:val="en-US"/>
+        </w:rPr>
+        <w:t>Token</w:t>
+      </w:r>
+      <w:r>
+        <w:t xml:space="preserve">», что позволяет пользователю обновить </w:t>
+      </w:r>
+      <w:r>
+        <w:rPr>
+          <w:lang w:val="en-US"/>
+        </w:rPr>
+        <w:t>JWT</w:t>
+      </w:r>
+      <w:r>
+        <w:t>-токен для дальнейшего использования приложения.</w:t>
+      </w:r>
+    </w:p>
+    <w:p>
+      <w:r>
+        <w:t>Поля сущности «</w:t>
+      </w:r>
+      <w:proofErr w:type="spellStart"/>
+      <w:r>
+        <w:rPr>
+          <w:lang w:val="en-US"/>
+        </w:rPr>
+        <w:t>RefreshToken</w:t>
+      </w:r>
+      <w:proofErr w:type="spellEnd"/>
+      <w:r>
+        <w:t>» представлены в списке ниже:</w:t>
+      </w:r>
+    </w:p>
+    <w:p/>
+    <w:p>
+      <w:pPr>
+        <w:rPr>
+          <w:lang w:val="en-US"/>
+        </w:rPr>
+      </w:pPr>
+      <w:r>
+        <w:rPr>
+          <w:lang w:val="en-US"/>
+        </w:rPr>
+        <w:t>- id,</w:t>
+      </w:r>
+    </w:p>
+    <w:p>
+      <w:pPr>
+        <w:rPr>
+          <w:lang w:val="en-US"/>
+        </w:rPr>
+      </w:pPr>
+      <w:r>
+        <w:rPr>
+          <w:lang w:val="en-US"/>
+        </w:rPr>
+        <w:t xml:space="preserve">- </w:t>
+      </w:r>
+      <w:proofErr w:type="spellStart"/>
+      <w:r>
+        <w:rPr>
+          <w:lang w:val="en-US"/>
+        </w:rPr>
+        <w:t>user_id</w:t>
+      </w:r>
+      <w:proofErr w:type="spellEnd"/>
+      <w:r>
+        <w:rPr>
+          <w:lang w:val="en-US"/>
+        </w:rPr>
+        <w:t xml:space="preserve"> (foreign key </w:t>
+      </w:r>
+      <w:proofErr w:type="spellStart"/>
+      <w:r>
+        <w:rPr>
+          <w:lang w:val="en-US"/>
+        </w:rPr>
+        <w:t>сущности</w:t>
+      </w:r>
+      <w:proofErr w:type="spellEnd"/>
+      <w:r>
+        <w:rPr>
+          <w:lang w:val="en-US"/>
+        </w:rPr>
+        <w:t xml:space="preserve"> «User»),</w:t>
+      </w:r>
+    </w:p>
+    <w:p>
+      <w:pPr>
+        <w:rPr>
+          <w:lang w:val="en-US"/>
+        </w:rPr>
+      </w:pPr>
+      <w:r>
+        <w:rPr>
+          <w:lang w:val="en-US"/>
+        </w:rPr>
+        <w:t>- token,</w:t>
+      </w:r>
+    </w:p>
+    <w:p>
+      <w:pPr>
+        <w:rPr>
+          <w:lang w:val="en-US"/>
+        </w:rPr>
+      </w:pPr>
+      <w:r>
+        <w:rPr>
+          <w:lang w:val="en-US"/>
+        </w:rPr>
+        <w:t xml:space="preserve">- </w:t>
+      </w:r>
+      <w:proofErr w:type="spellStart"/>
+      <w:r>
+        <w:rPr>
+          <w:lang w:val="en-US"/>
+        </w:rPr>
+        <w:t>expires_at</w:t>
+      </w:r>
+      <w:proofErr w:type="spellEnd"/>
+      <w:r>
+        <w:rPr>
+          <w:lang w:val="en-US"/>
+        </w:rPr>
+        <w:t>,</w:t>
+      </w:r>
+    </w:p>
+    <w:p>
+      <w:pPr>
+        <w:rPr>
+          <w:lang w:val="en-US"/>
+        </w:rPr>
+      </w:pPr>
+      <w:r>
+        <w:rPr>
+          <w:lang w:val="en-US"/>
+        </w:rPr>
+        <w:t xml:space="preserve">- </w:t>
+      </w:r>
+      <w:proofErr w:type="spellStart"/>
+      <w:r>
+        <w:rPr>
+          <w:lang w:val="en-US"/>
+        </w:rPr>
+        <w:t>is_revoked</w:t>
+      </w:r>
+      <w:proofErr w:type="spellEnd"/>
+      <w:r>
+        <w:rPr>
+          <w:lang w:val="en-US"/>
+        </w:rPr>
+        <w:t>,</w:t>
+      </w:r>
+    </w:p>
+    <w:p>
+      <w:pPr>
+        <w:rPr>
+          <w:lang w:val="en-US"/>
+        </w:rPr>
+      </w:pPr>
+      <w:r>
+        <w:rPr>
+          <w:lang w:val="en-US"/>
+        </w:rPr>
+        <w:t xml:space="preserve">- </w:t>
+      </w:r>
+      <w:proofErr w:type="spellStart"/>
+      <w:r>
+        <w:rPr>
+          <w:lang w:val="en-US"/>
+        </w:rPr>
+        <w:t>created_at</w:t>
+      </w:r>
+      <w:proofErr w:type="spellEnd"/>
+      <w:r>
+        <w:rPr>
+          <w:lang w:val="en-US"/>
+        </w:rPr>
+        <w:t>,</w:t>
+      </w:r>
+    </w:p>
+    <w:p>
+      <w:pPr>
+        <w:rPr>
+          <w:lang w:val="en-US"/>
+        </w:rPr>
+      </w:pPr>
+      <w:r>
+        <w:rPr>
+          <w:lang w:val="en-US"/>
+        </w:rPr>
+        <w:lastRenderedPageBreak/>
+        <w:t xml:space="preserve">- </w:t>
+      </w:r>
+      <w:proofErr w:type="spellStart"/>
+      <w:r>
+        <w:rPr>
+          <w:lang w:val="en-US"/>
+        </w:rPr>
+        <w:t>replaced_by_token</w:t>
+      </w:r>
+      <w:proofErr w:type="spellEnd"/>
+      <w:r>
+        <w:rPr>
+          <w:lang w:val="en-US"/>
+        </w:rPr>
+        <w:t>.</w:t>
+      </w:r>
+    </w:p>
+    <w:p>
+      <w:pPr>
+        <w:rPr>
+          <w:lang w:val="en-US"/>
+        </w:rPr>
+      </w:pPr>
+    </w:p>
+    <w:p>
+      <w:r>
+        <w:t>## Стек технологий</w:t>
+      </w:r>
+    </w:p>
+    <w:p/>
+    <w:p>
+      <w:r>
+        <w:t xml:space="preserve">- Язык программирования: </w:t>
+      </w:r>
+      <w:r>
+        <w:rPr>
+          <w:lang w:val="en-US"/>
+        </w:rPr>
+        <w:t>C</w:t>
+      </w:r>
+      <w:r>
+        <w:t>#</w:t>
+      </w:r>
+    </w:p>
+    <w:p>
+      <w:r>
+        <w:t>- .</w:t>
+      </w:r>
+      <w:r>
+        <w:rPr>
+          <w:lang w:val="en-US"/>
+        </w:rPr>
+        <w:t>NET</w:t>
+      </w:r>
+      <w:r>
+        <w:t xml:space="preserve"> 9.0 - Модульная платформа для разработки ПО</w:t>
+      </w:r>
+    </w:p>
+    <w:p>
+      <w:r>
+        <w:t xml:space="preserve">- </w:t>
+      </w:r>
+      <w:r>
+        <w:rPr>
+          <w:lang w:val="en-US"/>
+        </w:rPr>
+        <w:t>ASP</w:t>
+      </w:r>
+      <w:r>
+        <w:t xml:space="preserve"> .</w:t>
+      </w:r>
+      <w:r>
+        <w:rPr>
+          <w:lang w:val="en-US"/>
+        </w:rPr>
+        <w:t>NET</w:t>
+      </w:r>
+      <w:r>
+        <w:t xml:space="preserve"> </w:t>
+      </w:r>
+      <w:r>
+        <w:rPr>
+          <w:lang w:val="en-US"/>
+        </w:rPr>
+        <w:t>Core</w:t>
+      </w:r>
+      <w:r>
+        <w:t xml:space="preserve"> - Фреймворк для разработки веб-приложений</w:t>
+      </w:r>
+    </w:p>
+    <w:p>
+      <w:r>
+        <w:t xml:space="preserve">- </w:t>
+      </w:r>
+      <w:r>
+        <w:rPr>
+          <w:lang w:val="en-US"/>
+        </w:rPr>
+        <w:t>PostgreSQL</w:t>
+      </w:r>
+      <w:r>
+        <w:t xml:space="preserve"> - Система управления базами данных</w:t>
+      </w:r>
+    </w:p>
+    <w:p/>
+    <w:p>
+      <w:r>
+        <w:t>## Как запустить проект</w:t>
+      </w:r>
+    </w:p>
+    <w:p/>
+    <w:p>
+      <w:r>
+        <w:t>Для того чтобы запустить проект, на Вашем ПК должен быть установлен пакет .</w:t>
+      </w:r>
+      <w:r>
+        <w:rPr>
+          <w:lang w:val="en-US"/>
+        </w:rPr>
+        <w:t>NET</w:t>
+      </w:r>
+      <w:r>
+        <w:t xml:space="preserve"> </w:t>
+      </w:r>
+      <w:r>
+        <w:rPr>
+          <w:lang w:val="en-US"/>
+        </w:rPr>
+        <w:t>SDK</w:t>
+      </w:r>
+      <w:r>
+        <w:t>, поддерживающий версию .</w:t>
+      </w:r>
+      <w:r>
+        <w:rPr>
+          <w:lang w:val="en-US"/>
+        </w:rPr>
+        <w:t>NET</w:t>
+      </w:r>
+      <w:r>
+        <w:t xml:space="preserve"> 9.0.</w:t>
+      </w:r>
+    </w:p>
+    <w:p>
+      <w:r>
+        <w:t>Для запуска проекта необходимо перейти в директорию проекта и выполнить команду в любом удобном для Вас терминале: `</w:t>
+      </w:r>
+      <w:r>
+        <w:rPr>
+          <w:lang w:val="en-US"/>
+        </w:rPr>
+        <w:t>dotnet</w:t>
+      </w:r>
+      <w:r>
+        <w:t xml:space="preserve"> </w:t>
+      </w:r>
+      <w:r>
+        <w:rPr>
+          <w:lang w:val="en-US"/>
+        </w:rPr>
+        <w:t>run</w:t>
+      </w:r>
+      <w:r>
+        <w:t>`.</w:t>
+      </w:r>
+    </w:p>
+    <w:p/>
+    <w:p>
+      <w:r>
+        <w:t>Также перед запуском приложения можно осуществить сборку проекта с помощью команды `</w:t>
+      </w:r>
+      <w:r>
+        <w:rPr>
+          <w:lang w:val="en-US"/>
+        </w:rPr>
+        <w:t>dotnet</w:t>
+      </w:r>
+      <w:r>
+        <w:t xml:space="preserve"> </w:t>
+      </w:r>
+      <w:r>
+        <w:rPr>
+          <w:lang w:val="en-US"/>
+        </w:rPr>
+        <w:t>build</w:t>
+      </w:r>
+      <w:r>
+        <w:t>`.</w:t>
+      </w:r>
+    </w:p>
+    <w:p/>
+    <w:p>
+      <w:r>
+        <w:t>В случае, если Вам необходимо поменять порт, на котором будет запускаться веб-приложение, Вам необходимо открыть файл `</w:t>
+      </w:r>
+      <w:proofErr w:type="spellStart"/>
+      <w:r>
+        <w:rPr>
+          <w:lang w:val="en-US"/>
+        </w:rPr>
+        <w:t>launchSettings</w:t>
+      </w:r>
+      <w:proofErr w:type="spellEnd"/>
+      <w:r>
+        <w:t>.</w:t>
+      </w:r>
+      <w:r>
+        <w:rPr>
+          <w:lang w:val="en-US"/>
+        </w:rPr>
+        <w:t>json</w:t>
+      </w:r>
+      <w:r>
+        <w:t>` в папке `</w:t>
+      </w:r>
+      <w:r>
+        <w:rPr>
+          <w:lang w:val="en-US"/>
+        </w:rPr>
+        <w:t>Properties</w:t>
+      </w:r>
+      <w:r>
+        <w:t>` и изменить порт в поле `</w:t>
+      </w:r>
+      <w:proofErr w:type="spellStart"/>
+      <w:r>
+        <w:rPr>
+          <w:lang w:val="en-US"/>
+        </w:rPr>
+        <w:t>applicationUrl</w:t>
+      </w:r>
+      <w:proofErr w:type="spellEnd"/>
+      <w:r>
+        <w:t>`.</w:t>
+      </w:r>
+    </w:p>
+    <w:p/>
+    <w:p>
+      <w:r>
+        <w:t xml:space="preserve">## Описание маршрутов </w:t>
+      </w:r>
+      <w:r>
+        <w:rPr>
+          <w:lang w:val="en-US"/>
+        </w:rPr>
+        <w:t>API</w:t>
+      </w:r>
+    </w:p>
+    <w:p/>
+    <w:p>
+      <w:r>
+        <w:t xml:space="preserve">### Документация </w:t>
+      </w:r>
+      <w:r>
+        <w:rPr>
+          <w:lang w:val="en-US"/>
+        </w:rPr>
+        <w:t>Swagger</w:t>
+      </w:r>
+    </w:p>
+    <w:p/>
+    <w:p>
+      <w:r>
+        <w:t xml:space="preserve">Маршруты </w:t>
+      </w:r>
+      <w:r>
+        <w:rPr>
+          <w:lang w:val="en-US"/>
+        </w:rPr>
+        <w:t>API</w:t>
+      </w:r>
+      <w:r>
+        <w:t xml:space="preserve"> можно просмотреть с помощью </w:t>
+      </w:r>
+      <w:r>
+        <w:rPr>
+          <w:lang w:val="en-US"/>
+        </w:rPr>
+        <w:t>Swagger</w:t>
+      </w:r>
+      <w:r>
+        <w:t xml:space="preserve"> </w:t>
+      </w:r>
+      <w:r>
+        <w:rPr>
+          <w:lang w:val="en-US"/>
+        </w:rPr>
+        <w:t>UI</w:t>
+      </w:r>
+      <w:r>
+        <w:t>, предварительно запустив проект и перейти по пути `</w:t>
+      </w:r>
+      <w:r>
+        <w:rPr>
+          <w:lang w:val="en-US"/>
+        </w:rPr>
+        <w:t>http</w:t>
+      </w:r>
+      <w:r>
+        <w:t>://</w:t>
+      </w:r>
+      <w:r>
+        <w:rPr>
+          <w:lang w:val="en-US"/>
+        </w:rPr>
+        <w:t>localhost</w:t>
+      </w:r>
+      <w:r>
+        <w:t>:5279/</w:t>
+      </w:r>
+      <w:r>
+        <w:rPr>
+          <w:lang w:val="en-US"/>
+        </w:rPr>
+        <w:t>swagger</w:t>
+      </w:r>
+      <w:r>
+        <w:t>`.</w:t>
+      </w:r>
+    </w:p>
+    <w:p/>
+    <w:p>
+      <w:r>
+        <w:t>### Текстовое описание</w:t>
+      </w:r>
+    </w:p>
+    <w:p/>
+    <w:p>
+      <w:r>
+        <w:t xml:space="preserve">Доступ к ручкам осуществляется благодаря </w:t>
+      </w:r>
+      <w:r>
+        <w:rPr>
+          <w:lang w:val="en-US"/>
+        </w:rPr>
+        <w:t>API</w:t>
+      </w:r>
+      <w:r>
+        <w:t>-контроллерам, построенным вокруг конкретной задачи/сущности. В приложении описаны 3 контроллера:</w:t>
+      </w:r>
+    </w:p>
+    <w:p/>
+    <w:p>
+      <w:r>
+        <w:t xml:space="preserve">- </w:t>
+      </w:r>
+      <w:proofErr w:type="spellStart"/>
+      <w:r>
+        <w:rPr>
+          <w:lang w:val="en-US"/>
+        </w:rPr>
+        <w:t>AuthController</w:t>
+      </w:r>
+      <w:proofErr w:type="spellEnd"/>
+      <w:r>
+        <w:t xml:space="preserve"> (путь: “/</w:t>
+      </w:r>
+      <w:proofErr w:type="spellStart"/>
+      <w:r>
+        <w:rPr>
+          <w:lang w:val="en-US"/>
+        </w:rPr>
+        <w:t>api</w:t>
+      </w:r>
+      <w:proofErr w:type="spellEnd"/>
+      <w:r>
+        <w:t>/</w:t>
+      </w:r>
+      <w:r>
+        <w:rPr>
+          <w:lang w:val="en-US"/>
+        </w:rPr>
+        <w:t>auth</w:t>
+      </w:r>
+      <w:r>
+        <w:t>”),</w:t>
+      </w:r>
+    </w:p>
+    <w:p>
+      <w:r>
+        <w:t xml:space="preserve">- </w:t>
+      </w:r>
+      <w:proofErr w:type="spellStart"/>
+      <w:r>
+        <w:rPr>
+          <w:lang w:val="en-US"/>
+        </w:rPr>
+        <w:t>UserController</w:t>
+      </w:r>
+      <w:proofErr w:type="spellEnd"/>
+      <w:r>
+        <w:t xml:space="preserve"> (путь: “/</w:t>
+      </w:r>
+      <w:proofErr w:type="spellStart"/>
+      <w:r>
+        <w:rPr>
+          <w:lang w:val="en-US"/>
+        </w:rPr>
+        <w:t>api</w:t>
+      </w:r>
+      <w:proofErr w:type="spellEnd"/>
+      <w:r>
+        <w:t>/</w:t>
+      </w:r>
+      <w:r>
+        <w:rPr>
+          <w:lang w:val="en-US"/>
+        </w:rPr>
+        <w:t>user</w:t>
+      </w:r>
+      <w:r>
+        <w:t>”),</w:t>
+      </w:r>
+    </w:p>
+    <w:p>
+      <w:pPr>
+        <w:rPr>
+          <w:lang w:val="en-US"/>
+        </w:rPr>
+      </w:pPr>
+      <w:r>
+        <w:rPr>
+          <w:lang w:val="en-US"/>
+        </w:rPr>
+        <w:t xml:space="preserve">- </w:t>
+      </w:r>
+      <w:proofErr w:type="spellStart"/>
+      <w:r>
+        <w:rPr>
+          <w:lang w:val="en-US"/>
+        </w:rPr>
+        <w:t>ClientController</w:t>
+      </w:r>
+      <w:proofErr w:type="spellEnd"/>
+      <w:r>
+        <w:rPr>
+          <w:lang w:val="en-US"/>
+        </w:rPr>
+        <w:t xml:space="preserve"> (</w:t>
+      </w:r>
+      <w:proofErr w:type="spellStart"/>
+      <w:r>
+        <w:rPr>
+          <w:lang w:val="en-US"/>
+        </w:rPr>
+        <w:t>путь</w:t>
+      </w:r>
+      <w:proofErr w:type="spellEnd"/>
+      <w:r>
+        <w:rPr>
+          <w:lang w:val="en-US"/>
+        </w:rPr>
+        <w:t>: “/</w:t>
+      </w:r>
+      <w:proofErr w:type="spellStart"/>
+      <w:r>
+        <w:rPr>
+          <w:lang w:val="en-US"/>
+        </w:rPr>
+        <w:t>api</w:t>
+      </w:r>
+      <w:proofErr w:type="spellEnd"/>
+      <w:r>
+        <w:rPr>
+          <w:lang w:val="en-US"/>
+        </w:rPr>
+        <w:t>/client”).</w:t>
+      </w:r>
+    </w:p>
+    <w:p>
+      <w:pPr>
+        <w:rPr>
+          <w:lang w:val="en-US"/>
+        </w:rPr>
+      </w:pPr>
+    </w:p>
+    <w:p>
+      <w:pPr>
+        <w:rPr>
+          <w:lang w:val="en-US"/>
+        </w:rPr>
+      </w:pPr>
+      <w:r>
+        <w:rPr>
+          <w:lang w:val="en-US"/>
+        </w:rPr>
+        <w:t xml:space="preserve">#### </w:t>
+      </w:r>
+      <w:proofErr w:type="spellStart"/>
+      <w:r>
+        <w:rPr>
+          <w:lang w:val="en-US"/>
+        </w:rPr>
+        <w:t>AuthController</w:t>
+      </w:r>
+      <w:proofErr w:type="spellEnd"/>
+    </w:p>
+    <w:p>
+      <w:pPr>
+        <w:rPr>
+          <w:lang w:val="en-US"/>
+        </w:rPr>
+      </w:pPr>
+    </w:p>
+    <w:p>
+      <w:pPr>
+        <w:rPr>
+          <w:lang w:val="en-US"/>
+        </w:rPr>
+      </w:pPr>
+      <w:r>
+        <w:rPr>
+          <w:lang w:val="en-US"/>
+        </w:rPr>
+        <w:t xml:space="preserve">У </w:t>
+      </w:r>
+      <w:proofErr w:type="spellStart"/>
+      <w:r>
+        <w:rPr>
+          <w:lang w:val="en-US"/>
+        </w:rPr>
+        <w:t>AuthController</w:t>
+      </w:r>
+      <w:proofErr w:type="spellEnd"/>
+      <w:r>
+        <w:rPr>
+          <w:lang w:val="en-US"/>
+        </w:rPr>
+        <w:t xml:space="preserve"> </w:t>
+      </w:r>
+      <w:proofErr w:type="spellStart"/>
+      <w:r>
+        <w:rPr>
+          <w:lang w:val="en-US"/>
+        </w:rPr>
+        <w:t>имеется</w:t>
+      </w:r>
+      <w:proofErr w:type="spellEnd"/>
+      <w:r>
+        <w:rPr>
+          <w:lang w:val="en-US"/>
+        </w:rPr>
+        <w:t xml:space="preserve"> 3 </w:t>
+      </w:r>
+      <w:proofErr w:type="spellStart"/>
+      <w:r>
+        <w:rPr>
+          <w:lang w:val="en-US"/>
+        </w:rPr>
+        <w:t>ручки</w:t>
+      </w:r>
+      <w:proofErr w:type="spellEnd"/>
+      <w:r>
+        <w:rPr>
+          <w:lang w:val="en-US"/>
+        </w:rPr>
+        <w:t>:</w:t>
+      </w:r>
+    </w:p>
+    <w:p>
+      <w:pPr>
+        <w:rPr>
+          <w:lang w:val="en-US"/>
+        </w:rPr>
+      </w:pPr>
+    </w:p>
+    <w:p>
+      <w:pPr>
+        <w:rPr>
+          <w:lang w:val="en-US"/>
+        </w:rPr>
+      </w:pPr>
+      <w:r>
+        <w:rPr>
+          <w:lang w:val="en-US"/>
+        </w:rPr>
+        <w:t>- Login (POST “/</w:t>
+      </w:r>
+      <w:proofErr w:type="spellStart"/>
+      <w:r>
+        <w:rPr>
+          <w:lang w:val="en-US"/>
+        </w:rPr>
+        <w:t>api</w:t>
+      </w:r>
+      <w:proofErr w:type="spellEnd"/>
+      <w:r>
+        <w:rPr>
+          <w:lang w:val="en-US"/>
+        </w:rPr>
+        <w:t>/auth/login”),</w:t>
+      </w:r>
+    </w:p>
+    <w:p>
+      <w:pPr>
+        <w:rPr>
+          <w:lang w:val="en-US"/>
+        </w:rPr>
+      </w:pPr>
+      <w:r>
+        <w:rPr>
+          <w:lang w:val="en-US"/>
+        </w:rPr>
+        <w:t>- Logout (POST “/</w:t>
+      </w:r>
+      <w:proofErr w:type="spellStart"/>
+      <w:r>
+        <w:rPr>
+          <w:lang w:val="en-US"/>
+        </w:rPr>
+        <w:t>api</w:t>
+      </w:r>
+      <w:proofErr w:type="spellEnd"/>
+      <w:r>
+        <w:rPr>
+          <w:lang w:val="en-US"/>
+        </w:rPr>
+        <w:t>/auth/logout”),</w:t>
+      </w:r>
+    </w:p>
+    <w:p>
+      <w:pPr>
+        <w:rPr>
+          <w:lang w:val="en-US"/>
+        </w:rPr>
+      </w:pPr>
+      <w:r>
+        <w:rPr>
+          <w:lang w:val="en-US"/>
+        </w:rPr>
+        <w:t>- Refresh (POST “/</w:t>
+      </w:r>
+      <w:proofErr w:type="spellStart"/>
+      <w:r>
+        <w:rPr>
+          <w:lang w:val="en-US"/>
+        </w:rPr>
+        <w:t>api</w:t>
+      </w:r>
+      <w:proofErr w:type="spellEnd"/>
+      <w:r>
+        <w:rPr>
+          <w:lang w:val="en-US"/>
+        </w:rPr>
+        <w:t>/auth/refresh”).</w:t>
+      </w:r>
+    </w:p>
+    <w:p>
+      <w:pPr>
+        <w:rPr>
+          <w:lang w:val="en-US"/>
+        </w:rPr>
+      </w:pPr>
+    </w:p>
+    <w:p>
+      <w:pPr>
+        <w:rPr>
+          <w:lang w:val="en-US"/>
+        </w:rPr>
+      </w:pPr>
+      <w:r>
+        <w:rPr>
+          <w:lang w:val="en-US"/>
+        </w:rPr>
+        <w:t xml:space="preserve">#### </w:t>
+      </w:r>
+      <w:proofErr w:type="spellStart"/>
+      <w:r>
+        <w:rPr>
+          <w:lang w:val="en-US"/>
+        </w:rPr>
+        <w:t>UserController</w:t>
+      </w:r>
+      <w:proofErr w:type="spellEnd"/>
+    </w:p>
+    <w:p>
+      <w:pPr>
+        <w:rPr>
+          <w:lang w:val="en-US"/>
+        </w:rPr>
+      </w:pPr>
+    </w:p>
+    <w:p>
+      <w:pPr>
+        <w:rPr>
+          <w:lang w:val="en-US"/>
+        </w:rPr>
+      </w:pPr>
+      <w:r>
+        <w:rPr>
+          <w:lang w:val="en-US"/>
+        </w:rPr>
+        <w:t xml:space="preserve">У </w:t>
+      </w:r>
+      <w:proofErr w:type="spellStart"/>
+      <w:r>
+        <w:rPr>
+          <w:lang w:val="en-US"/>
+        </w:rPr>
+        <w:t>UserController</w:t>
+      </w:r>
+      <w:proofErr w:type="spellEnd"/>
+      <w:r>
+        <w:rPr>
+          <w:lang w:val="en-US"/>
+        </w:rPr>
+        <w:t xml:space="preserve"> </w:t>
+      </w:r>
+      <w:proofErr w:type="spellStart"/>
+      <w:r>
+        <w:rPr>
+          <w:lang w:val="en-US"/>
+        </w:rPr>
+        <w:t>имеется</w:t>
+      </w:r>
+      <w:proofErr w:type="spellEnd"/>
+      <w:r>
+        <w:rPr>
+          <w:lang w:val="en-US"/>
+        </w:rPr>
+        <w:t xml:space="preserve"> 7 </w:t>
+      </w:r>
+      <w:proofErr w:type="spellStart"/>
+      <w:r>
+        <w:rPr>
+          <w:lang w:val="en-US"/>
+        </w:rPr>
+        <w:t>ручек</w:t>
+      </w:r>
+      <w:proofErr w:type="spellEnd"/>
+      <w:r>
+        <w:rPr>
+          <w:lang w:val="en-US"/>
+        </w:rPr>
+        <w:t>:</w:t>
+      </w:r>
+    </w:p>
+    <w:p>
+      <w:pPr>
+        <w:rPr>
+          <w:lang w:val="en-US"/>
+        </w:rPr>
+      </w:pPr>
+    </w:p>
+    <w:p>
+      <w:pPr>
+        <w:rPr>
+          <w:lang w:val="en-US"/>
+        </w:rPr>
+      </w:pPr>
+      <w:r>
+        <w:rPr>
+          <w:lang w:val="en-US"/>
+        </w:rPr>
+        <w:t xml:space="preserve">- </w:t>
+      </w:r>
+      <w:proofErr w:type="spellStart"/>
+      <w:r>
+        <w:rPr>
+          <w:lang w:val="en-US"/>
+        </w:rPr>
+        <w:t>GetAll</w:t>
+      </w:r>
+      <w:proofErr w:type="spellEnd"/>
+      <w:r>
+        <w:rPr>
+          <w:lang w:val="en-US"/>
+        </w:rPr>
+        <w:t xml:space="preserve"> (GET “/</w:t>
+      </w:r>
+      <w:proofErr w:type="spellStart"/>
+      <w:r>
+        <w:rPr>
+          <w:lang w:val="en-US"/>
+        </w:rPr>
+        <w:t>api</w:t>
+      </w:r>
+      <w:proofErr w:type="spellEnd"/>
+      <w:r>
+        <w:rPr>
+          <w:lang w:val="en-US"/>
+        </w:rPr>
+        <w:t>/user”),</w:t>
+      </w:r>
+    </w:p>
+    <w:p>
+      <w:pPr>
+        <w:rPr>
+          <w:lang w:val="en-US"/>
+        </w:rPr>
+      </w:pPr>
+      <w:r>
+        <w:rPr>
+          <w:lang w:val="en-US"/>
+        </w:rPr>
+        <w:t xml:space="preserve">- </w:t>
+      </w:r>
+      <w:proofErr w:type="spellStart"/>
+      <w:r>
+        <w:rPr>
+          <w:lang w:val="en-US"/>
+        </w:rPr>
+        <w:t>GetById</w:t>
+      </w:r>
+      <w:proofErr w:type="spellEnd"/>
+      <w:r>
+        <w:rPr>
+          <w:lang w:val="en-US"/>
+        </w:rPr>
+        <w:t xml:space="preserve"> (GET “/</w:t>
+      </w:r>
+      <w:proofErr w:type="spellStart"/>
+      <w:r>
+        <w:rPr>
+          <w:lang w:val="en-US"/>
+        </w:rPr>
+        <w:t>api</w:t>
+      </w:r>
+      <w:proofErr w:type="spellEnd"/>
+      <w:r>
+        <w:rPr>
+          <w:lang w:val="en-US"/>
+        </w:rPr>
+        <w:t>/user/{id}”),</w:t>
+      </w:r>
+    </w:p>
+    <w:p>
+      <w:pPr>
+        <w:rPr>
+          <w:lang w:val="en-US"/>
+        </w:rPr>
+      </w:pPr>
+      <w:r>
+        <w:rPr>
+          <w:lang w:val="en-US"/>
+        </w:rPr>
+        <w:t xml:space="preserve">- </w:t>
+      </w:r>
+      <w:proofErr w:type="spellStart"/>
+      <w:r>
+        <w:rPr>
+          <w:lang w:val="en-US"/>
+        </w:rPr>
+        <w:t>GetByLogin</w:t>
+      </w:r>
+      <w:proofErr w:type="spellEnd"/>
+      <w:r>
+        <w:rPr>
+          <w:lang w:val="en-US"/>
+        </w:rPr>
+        <w:t xml:space="preserve"> (GET “/</w:t>
+      </w:r>
+      <w:proofErr w:type="spellStart"/>
+      <w:r>
+        <w:rPr>
+          <w:lang w:val="en-US"/>
+        </w:rPr>
+        <w:t>api</w:t>
+      </w:r>
+      <w:proofErr w:type="spellEnd"/>
+      <w:r>
+        <w:rPr>
+          <w:lang w:val="en-US"/>
+        </w:rPr>
+        <w:t>/user/</w:t>
+      </w:r>
+      <w:proofErr w:type="spellStart"/>
+      <w:r>
+        <w:rPr>
+          <w:lang w:val="en-US"/>
+        </w:rPr>
+        <w:t>by-login?login</w:t>
+      </w:r>
+      <w:proofErr w:type="spellEnd"/>
+      <w:r>
+        <w:rPr>
+          <w:lang w:val="en-US"/>
+        </w:rPr>
+        <w:t>={login}”),</w:t>
+      </w:r>
+    </w:p>
+    <w:p>
+      <w:pPr>
+        <w:rPr>
+          <w:lang w:val="en-US"/>
+        </w:rPr>
+      </w:pPr>
+      <w:r>
+        <w:rPr>
+          <w:lang w:val="en-US"/>
+        </w:rPr>
+        <w:t>- Add (POST “/</w:t>
+      </w:r>
+      <w:proofErr w:type="spellStart"/>
+      <w:r>
+        <w:rPr>
+          <w:lang w:val="en-US"/>
+        </w:rPr>
+        <w:t>api</w:t>
+      </w:r>
+      <w:proofErr w:type="spellEnd"/>
+      <w:r>
+        <w:rPr>
+          <w:lang w:val="en-US"/>
+        </w:rPr>
+        <w:t>/user”),</w:t>
+      </w:r>
+    </w:p>
+    <w:p>
+      <w:pPr>
+        <w:rPr>
+          <w:lang w:val="en-US"/>
+        </w:rPr>
+      </w:pPr>
+      <w:r>
+        <w:rPr>
+          <w:lang w:val="en-US"/>
+        </w:rPr>
+        <w:t>- Update (PUT “/</w:t>
+      </w:r>
+      <w:proofErr w:type="spellStart"/>
+      <w:r>
+        <w:rPr>
+          <w:lang w:val="en-US"/>
+        </w:rPr>
+        <w:t>api</w:t>
+      </w:r>
+      <w:proofErr w:type="spellEnd"/>
+      <w:r>
+        <w:rPr>
+          <w:lang w:val="en-US"/>
+        </w:rPr>
+        <w:t>/user/{id}),</w:t>
+      </w:r>
+    </w:p>
+    <w:p>
+      <w:pPr>
+        <w:rPr>
+          <w:lang w:val="en-US"/>
+        </w:rPr>
+      </w:pPr>
+      <w:r>
+        <w:rPr>
+          <w:lang w:val="en-US"/>
+        </w:rPr>
+        <w:t xml:space="preserve">- </w:t>
+      </w:r>
+      <w:proofErr w:type="spellStart"/>
+      <w:r>
+        <w:rPr>
+          <w:lang w:val="en-US"/>
+        </w:rPr>
+        <w:t>PartialUpdate</w:t>
+      </w:r>
+      <w:proofErr w:type="spellEnd"/>
+      <w:r>
+        <w:rPr>
+          <w:lang w:val="en-US"/>
+        </w:rPr>
+        <w:t xml:space="preserve"> (PATCH “/</w:t>
+      </w:r>
+      <w:proofErr w:type="spellStart"/>
+      <w:r>
+        <w:rPr>
+          <w:lang w:val="en-US"/>
+        </w:rPr>
+        <w:t>api</w:t>
+      </w:r>
+      <w:proofErr w:type="spellEnd"/>
+      <w:r>
+        <w:rPr>
+          <w:lang w:val="en-US"/>
+        </w:rPr>
+        <w:t>/user/{id}),</w:t>
+      </w:r>
+    </w:p>
+    <w:p>
+      <w:pPr>
+        <w:rPr>
+          <w:lang w:val="en-US"/>
+        </w:rPr>
+      </w:pPr>
+      <w:r>
+        <w:rPr>
+          <w:lang w:val="en-US"/>
+        </w:rPr>
+        <w:t>- Delete (DELETE “/</w:t>
+      </w:r>
+      <w:proofErr w:type="spellStart"/>
+      <w:r>
+        <w:rPr>
+          <w:lang w:val="en-US"/>
+        </w:rPr>
+        <w:t>api</w:t>
+      </w:r>
+      <w:proofErr w:type="spellEnd"/>
+      <w:r>
+        <w:rPr>
+          <w:lang w:val="en-US"/>
+        </w:rPr>
+        <w:t>/user/{id}).</w:t>
+      </w:r>
+    </w:p>
+    <w:p>
+      <w:pPr>
+        <w:rPr>
+          <w:lang w:val="en-US"/>
+        </w:rPr>
+      </w:pPr>
+    </w:p>
+    <w:p>
+      <w:pPr>
+        <w:rPr>
+          <w:lang w:val="en-US"/>
+        </w:rPr>
+      </w:pPr>
+      <w:r>
+        <w:rPr>
+          <w:lang w:val="en-US"/>
+        </w:rPr>
+        <w:t xml:space="preserve">#### </w:t>
+      </w:r>
+      <w:proofErr w:type="spellStart"/>
+      <w:r>
+        <w:rPr>
+          <w:lang w:val="en-US"/>
+        </w:rPr>
+        <w:t>ClientController</w:t>
+      </w:r>
+      <w:proofErr w:type="spellEnd"/>
+    </w:p>
+    <w:p>
+      <w:pPr>
+        <w:rPr>
+          <w:lang w:val="en-US"/>
+        </w:rPr>
+      </w:pPr>
+    </w:p>
+    <w:p>
+      <w:pPr>
+        <w:rPr>
+          <w:lang w:val="en-US"/>
+        </w:rPr>
+      </w:pPr>
+      <w:r>
+        <w:rPr>
+          <w:lang w:val="en-US"/>
+        </w:rPr>
+        <w:t xml:space="preserve">У </w:t>
+      </w:r>
+      <w:proofErr w:type="spellStart"/>
+      <w:r>
+        <w:rPr>
+          <w:lang w:val="en-US"/>
+        </w:rPr>
+        <w:t>ClientController</w:t>
+      </w:r>
+      <w:proofErr w:type="spellEnd"/>
+      <w:r>
+        <w:rPr>
+          <w:lang w:val="en-US"/>
+        </w:rPr>
+        <w:t xml:space="preserve"> </w:t>
+      </w:r>
+      <w:proofErr w:type="spellStart"/>
+      <w:r>
+        <w:rPr>
+          <w:lang w:val="en-US"/>
+        </w:rPr>
+        <w:t>имеется</w:t>
+      </w:r>
+      <w:proofErr w:type="spellEnd"/>
+      <w:r>
+        <w:rPr>
+          <w:lang w:val="en-US"/>
+        </w:rPr>
+        <w:t xml:space="preserve"> 7 </w:t>
+      </w:r>
+      <w:proofErr w:type="spellStart"/>
+      <w:r>
+        <w:rPr>
+          <w:lang w:val="en-US"/>
+        </w:rPr>
+        <w:t>ручек</w:t>
+      </w:r>
+      <w:proofErr w:type="spellEnd"/>
+      <w:r>
+        <w:rPr>
+          <w:lang w:val="en-US"/>
+        </w:rPr>
+        <w:t>:</w:t>
+      </w:r>
+    </w:p>
+    <w:p>
+      <w:pPr>
+        <w:rPr>
+          <w:lang w:val="en-US"/>
+        </w:rPr>
+      </w:pPr>
+    </w:p>
+    <w:p>
+      <w:pPr>
+        <w:rPr>
+          <w:lang w:val="en-US"/>
+        </w:rPr>
+      </w:pPr>
+      <w:r>
+        <w:rPr>
+          <w:lang w:val="en-US"/>
+        </w:rPr>
+        <w:t xml:space="preserve">- </w:t>
+      </w:r>
+      <w:proofErr w:type="spellStart"/>
+      <w:r>
+        <w:rPr>
+          <w:lang w:val="en-US"/>
+        </w:rPr>
+        <w:t>GetAll</w:t>
+      </w:r>
+      <w:proofErr w:type="spellEnd"/>
+      <w:r>
+        <w:rPr>
+          <w:lang w:val="en-US"/>
+        </w:rPr>
+        <w:t xml:space="preserve"> (GET “/</w:t>
+      </w:r>
+      <w:proofErr w:type="spellStart"/>
+      <w:r>
+        <w:rPr>
+          <w:lang w:val="en-US"/>
+        </w:rPr>
+        <w:t>api</w:t>
+      </w:r>
+      <w:proofErr w:type="spellEnd"/>
+      <w:r>
+        <w:rPr>
+          <w:lang w:val="en-US"/>
+        </w:rPr>
+        <w:t>/client”),</w:t>
+      </w:r>
+    </w:p>
+    <w:p>
+      <w:pPr>
+        <w:rPr>
+          <w:lang w:val="en-US"/>
+        </w:rPr>
+      </w:pPr>
+      <w:r>
+        <w:rPr>
+          <w:lang w:val="en-US"/>
+        </w:rPr>
+        <w:t xml:space="preserve">- </w:t>
+      </w:r>
+      <w:proofErr w:type="spellStart"/>
+      <w:r>
+        <w:rPr>
+          <w:lang w:val="en-US"/>
+        </w:rPr>
+        <w:t>GetById</w:t>
+      </w:r>
+      <w:proofErr w:type="spellEnd"/>
+      <w:r>
+        <w:rPr>
+          <w:lang w:val="en-US"/>
+        </w:rPr>
+        <w:t xml:space="preserve"> (GET “/</w:t>
+      </w:r>
+      <w:proofErr w:type="spellStart"/>
+      <w:r>
+        <w:rPr>
+          <w:lang w:val="en-US"/>
+        </w:rPr>
+        <w:t>api</w:t>
+      </w:r>
+      <w:proofErr w:type="spellEnd"/>
+      <w:r>
+        <w:rPr>
+          <w:lang w:val="en-US"/>
+        </w:rPr>
+        <w:t>/client/{id}”),</w:t>
+      </w:r>
+    </w:p>
+    <w:p>
+      <w:pPr>
+        <w:rPr>
+          <w:lang w:val="en-US"/>
+        </w:rPr>
+      </w:pPr>
+      <w:r>
+        <w:rPr>
+          <w:lang w:val="en-US"/>
+        </w:rPr>
+        <w:t xml:space="preserve">- </w:t>
+      </w:r>
+      <w:proofErr w:type="spellStart"/>
+      <w:r>
+        <w:rPr>
+          <w:lang w:val="en-US"/>
+        </w:rPr>
+        <w:t>GetByEmail</w:t>
+      </w:r>
+      <w:proofErr w:type="spellEnd"/>
+      <w:r>
+        <w:rPr>
+          <w:lang w:val="en-US"/>
+        </w:rPr>
+        <w:t xml:space="preserve"> (GET “/</w:t>
+      </w:r>
+      <w:proofErr w:type="spellStart"/>
+      <w:r>
+        <w:rPr>
+          <w:lang w:val="en-US"/>
+        </w:rPr>
+        <w:t>api</w:t>
+      </w:r>
+      <w:proofErr w:type="spellEnd"/>
+      <w:r>
+        <w:rPr>
+          <w:lang w:val="en-US"/>
+        </w:rPr>
+        <w:t>/client/</w:t>
+      </w:r>
+      <w:proofErr w:type="spellStart"/>
+      <w:r>
+        <w:rPr>
+          <w:lang w:val="en-US"/>
+        </w:rPr>
+        <w:t>by-email?email</w:t>
+      </w:r>
+      <w:proofErr w:type="spellEnd"/>
+      <w:r>
+        <w:rPr>
+          <w:lang w:val="en-US"/>
+        </w:rPr>
+        <w:t>={email}”),</w:t>
+      </w:r>
+    </w:p>
+    <w:p>
+      <w:pPr>
+        <w:rPr>
+          <w:lang w:val="en-US"/>
+        </w:rPr>
+      </w:pPr>
+      <w:r>
+        <w:rPr>
+          <w:lang w:val="en-US"/>
+        </w:rPr>
+        <w:t>- Add (POST “/</w:t>
+      </w:r>
+      <w:proofErr w:type="spellStart"/>
+      <w:r>
+        <w:rPr>
+          <w:lang w:val="en-US"/>
+        </w:rPr>
+        <w:t>api</w:t>
+      </w:r>
+      <w:proofErr w:type="spellEnd"/>
+      <w:r>
+        <w:rPr>
+          <w:lang w:val="en-US"/>
+        </w:rPr>
+        <w:t>/client”),</w:t>
+      </w:r>
+    </w:p>
+    <w:p>
+      <w:pPr>
+        <w:rPr>
+          <w:lang w:val="en-US"/>
+        </w:rPr>
+      </w:pPr>
+      <w:r>
+        <w:rPr>
+          <w:lang w:val="en-US"/>
+        </w:rPr>
+        <w:t>- Update (PUT “/</w:t>
+      </w:r>
+      <w:proofErr w:type="spellStart"/>
+      <w:r>
+        <w:rPr>
+          <w:lang w:val="en-US"/>
+        </w:rPr>
+        <w:t>api</w:t>
+      </w:r>
+      <w:proofErr w:type="spellEnd"/>
+      <w:r>
+        <w:rPr>
+          <w:lang w:val="en-US"/>
+        </w:rPr>
+        <w:t>/client/{id}),</w:t>
+      </w:r>
+    </w:p>
+    <w:p>
+      <w:pPr>
+        <w:rPr>
+          <w:lang w:val="en-US"/>
+        </w:rPr>
+      </w:pPr>
+      <w:r>
+        <w:rPr>
+          <w:lang w:val="en-US"/>
+        </w:rPr>
+        <w:t xml:space="preserve">- </w:t>
+      </w:r>
+      <w:proofErr w:type="spellStart"/>
+      <w:r>
+        <w:rPr>
+          <w:lang w:val="en-US"/>
+        </w:rPr>
+        <w:t>PartialUpdate</w:t>
+      </w:r>
+      <w:proofErr w:type="spellEnd"/>
+      <w:r>
+        <w:rPr>
+          <w:lang w:val="en-US"/>
+        </w:rPr>
+        <w:t xml:space="preserve"> (PATCH “/</w:t>
+      </w:r>
+      <w:proofErr w:type="spellStart"/>
+      <w:r>
+        <w:rPr>
+          <w:lang w:val="en-US"/>
+        </w:rPr>
+        <w:t>api</w:t>
+      </w:r>
+      <w:proofErr w:type="spellEnd"/>
+      <w:r>
+        <w:rPr>
+          <w:lang w:val="en-US"/>
+        </w:rPr>
+        <w:t>/client/{id}),</w:t>
+      </w:r>
+    </w:p>
+    <w:p>
+      <w:pPr>
+        <w:rPr>
+          <w:lang w:val="en-US"/>
+        </w:rPr>
+      </w:pPr>
+      <w:r>
+        <w:rPr>
+          <w:lang w:val="en-US"/>
+        </w:rPr>
+        <w:t>- Delete (DELETE “/</w:t>
+      </w:r>
+      <w:proofErr w:type="spellStart"/>
+      <w:r>
+        <w:rPr>
+          <w:lang w:val="en-US"/>
+        </w:rPr>
+        <w:t>api</w:t>
+      </w:r>
+      <w:proofErr w:type="spellEnd"/>
+      <w:r>
+        <w:rPr>
+          <w:lang w:val="en-US"/>
+        </w:rPr>
+        <w:t>/client/{id}).</w:t>
+      </w:r>
+    </w:p>
+    <w:p>
+      <w:pPr>
+        <w:rPr>
+          <w:lang w:val="en-US"/>
+        </w:rPr>
+      </w:pPr>
+    </w:p>
+    <w:p>
+      <w:r>
+        <w:t>## Примеры запросов и ответов</w:t>
+      </w:r>
+    </w:p>
+    <w:p/>
+    <w:p>
+      <w:r>
+        <w:t xml:space="preserve">### Документация </w:t>
+      </w:r>
+      <w:r>
+        <w:rPr>
+          <w:lang w:val="en-US"/>
+        </w:rPr>
+        <w:t>Swagger</w:t>
+      </w:r>
+    </w:p>
+    <w:p/>
+    <w:p>
+      <w:r>
+        <w:t xml:space="preserve">Примеры запросов и ответов можно просмотреть с помощью </w:t>
+      </w:r>
+      <w:r>
+        <w:rPr>
+          <w:lang w:val="en-US"/>
+        </w:rPr>
+        <w:t>Swagger</w:t>
+      </w:r>
+      <w:r>
+        <w:t xml:space="preserve"> </w:t>
+      </w:r>
+      <w:r>
+        <w:rPr>
+          <w:lang w:val="en-US"/>
+        </w:rPr>
+        <w:t>UI</w:t>
+      </w:r>
+      <w:r>
+        <w:t xml:space="preserve"> во вкладке конкретного метода, предварительно запустив проект и перейдя по пути `</w:t>
+      </w:r>
+      <w:r>
+        <w:rPr>
+          <w:lang w:val="en-US"/>
+        </w:rPr>
+        <w:t>http</w:t>
+      </w:r>
+      <w:r>
+        <w:t>://</w:t>
+      </w:r>
+      <w:r>
+        <w:rPr>
+          <w:lang w:val="en-US"/>
+        </w:rPr>
+        <w:t>localhost</w:t>
+      </w:r>
+      <w:r>
+        <w:t>:5279/</w:t>
+      </w:r>
+      <w:r>
+        <w:rPr>
+          <w:lang w:val="en-US"/>
+        </w:rPr>
+        <w:t>swagger</w:t>
+      </w:r>
+      <w:r>
+        <w:t>`.</w:t>
+      </w:r>
+    </w:p>
+    <w:p/>
+    <w:p>
+      <w:r>
+        <w:t>## Примеры ошибок</w:t>
+      </w:r>
+    </w:p>
+    <w:p/>
+    <w:p>
+      <w:r>
+        <w:t xml:space="preserve">Примеры ошибок при выполнении запросов можно просмотреть с помощью </w:t>
+      </w:r>
+      <w:r>
+        <w:rPr>
+          <w:lang w:val="en-US"/>
+        </w:rPr>
+        <w:t>Swagger</w:t>
+      </w:r>
+      <w:r>
+        <w:t xml:space="preserve"> </w:t>
+      </w:r>
+      <w:r>
+        <w:rPr>
+          <w:lang w:val="en-US"/>
+        </w:rPr>
+        <w:t>UI</w:t>
+      </w:r>
+      <w:r>
+        <w:t xml:space="preserve"> во вкладке конкретного метода, в разделе **"</w:t>
+      </w:r>
+      <w:r>
+        <w:rPr>
+          <w:lang w:val="en-US"/>
+        </w:rPr>
+        <w:t>Responses</w:t>
+      </w:r>
+      <w:r>
+        <w:t>"**, предварительно запустив проект и перейдя по пути `</w:t>
+      </w:r>
+      <w:r>
+        <w:rPr>
+          <w:lang w:val="en-US"/>
+        </w:rPr>
+        <w:t>http</w:t>
+      </w:r>
+      <w:r>
+        <w:t>://</w:t>
+      </w:r>
+      <w:r>
+        <w:rPr>
+          <w:lang w:val="en-US"/>
+        </w:rPr>
+        <w:t>localhost</w:t>
+      </w:r>
+      <w:r>
+        <w:t>:5279/</w:t>
+      </w:r>
+      <w:r>
+        <w:rPr>
+          <w:lang w:val="en-US"/>
+        </w:rPr>
+        <w:t>swagger</w:t>
+      </w:r>
+      <w:r>
+        <w:t>`.</w:t>
+      </w:r>
+    </w:p>
+    <w:p/>
+    <w:p>
+      <w:r>
+        <w:lastRenderedPageBreak/>
+        <w:t>## Описание структуры проекта</w:t>
+      </w:r>
+    </w:p>
+    <w:p/>
+    <w:p>
+      <w:r>
+        <w:t xml:space="preserve">Описание структуры проекта можно просмотреть в [репозитории </w:t>
+      </w:r>
+      <w:proofErr w:type="gramStart"/>
+      <w:r>
+        <w:rPr>
+          <w:lang w:val="en-US"/>
+        </w:rPr>
+        <w:t>GitHub</w:t>
+      </w:r>
+      <w:r>
+        <w:t>](</w:t>
+      </w:r>
+      <w:proofErr w:type="gramEnd"/>
+      <w:r>
+        <w:rPr>
+          <w:lang w:val="en-US"/>
+        </w:rPr>
+        <w:t>https</w:t>
+      </w:r>
+      <w:r>
+        <w:t>://</w:t>
+      </w:r>
+      <w:proofErr w:type="spellStart"/>
+      <w:r>
+        <w:rPr>
+          <w:lang w:val="en-US"/>
+        </w:rPr>
+        <w:t>github</w:t>
+      </w:r>
+      <w:proofErr w:type="spellEnd"/>
+      <w:r>
+        <w:t>.</w:t>
+      </w:r>
+      <w:r>
+        <w:rPr>
+          <w:lang w:val="en-US"/>
+        </w:rPr>
+        <w:t>com</w:t>
+      </w:r>
+      <w:r>
+        <w:t>/</w:t>
+      </w:r>
+      <w:proofErr w:type="spellStart"/>
+      <w:r>
+        <w:rPr>
+          <w:lang w:val="en-US"/>
+        </w:rPr>
+        <w:t>Mordahaoff</w:t>
+      </w:r>
+      <w:proofErr w:type="spellEnd"/>
+      <w:r>
+        <w:t>/</w:t>
+      </w:r>
+      <w:r>
+        <w:rPr>
+          <w:lang w:val="en-US"/>
+        </w:rPr>
+        <w:t>backend</w:t>
+      </w:r>
+      <w:r>
+        <w:t>-</w:t>
+      </w:r>
+      <w:r>
+        <w:rPr>
+          <w:lang w:val="en-US"/>
+        </w:rPr>
+        <w:t>development</w:t>
+      </w:r>
+      <w:r>
+        <w:t>/</w:t>
+      </w:r>
+      <w:r>
+        <w:rPr>
+          <w:lang w:val="en-US"/>
+        </w:rPr>
+        <w:t>tree</w:t>
+      </w:r>
+      <w:r>
+        <w:t>/</w:t>
+      </w:r>
+      <w:r>
+        <w:rPr>
+          <w:lang w:val="en-US"/>
+        </w:rPr>
+        <w:t>dev</w:t>
+      </w:r>
+      <w:r>
+        <w:t>).</w:t>
+      </w:r>
     </w:p>
     <w:sectPr>
       <w:type w:val="continuous"/>
@@ -13646,7 +15775,7 @@
 </file>
 
 <file path=customXml/itemProps1.xml><?xml version="1.0" encoding="utf-8"?>
-<ds:datastoreItem xmlns:ds="http://schemas.openxmlformats.org/officeDocument/2006/customXml" ds:itemID="{84B55E52-597A-4413-9070-E5C833892963}">
+<ds:datastoreItem xmlns:ds="http://schemas.openxmlformats.org/officeDocument/2006/customXml" ds:itemID="{748F2B64-9698-40CC-BE5A-86F73E26A33C}">
   <ds:schemaRefs>
     <ds:schemaRef ds:uri="http://schemas.openxmlformats.org/officeDocument/2006/bibliography"/>
   </ds:schemaRefs>

</xml_diff>